<commit_message>
Align Initiation timeline across chapters
</commit_message>
<xml_diff>
--- a/manuscript/chapter-01-assigned-to-witness.docx
+++ b/manuscript/chapter-01-assigned-to-witness.docx
@@ -10,7 +10,11 @@
         <w:t>Chapter 1: Assigned to Witness</w:t>
       </w:r>
     </w:p>
-    <w:p/>
+    <w:p>
+      <w:r>
+        <w:t>## Day Zero: Assignment</w:t>
+      </w:r>
+    </w:p>
     <w:p>
       <w:r>
         <w:t>Elara woke at 3:00 a.m., on schedule, before the city lights shifted to dawn mode.</w:t>
@@ -63,11 +67,7 @@
     </w:p>
     <w:p>
       <w:r>
-        <w:t xml:space="preserve">Everyone in Trinity understood what the Initiation meant: false hope, engineered fear, pain, suffering, and sometimes blood. Alongside the guilt came anticipation, sometimes even excitement. Children entering the Initiation still believed something might change for them. </w:t>
-      </w:r>
-      <w:r>
-        <w:lastRenderedPageBreak/>
-        <w:t>The monitors wondered what they would witness and whether they could control it when the system went off-script.</w:t>
+        <w:t>Everyone in Trinity understood what the Initiation meant: false hope, engineered fear, pain, suffering, and sometimes blood. Alongside the guilt came anticipation, sometimes even excitement. Children entering the Initiation still believed something might change for them. The monitors wondered what they would witness and whether they could control it when the system went off-script.</w:t>
       </w:r>
     </w:p>
     <w:p>
@@ -137,7 +137,6 @@
     </w:p>
     <w:p>
       <w:r>
-        <w:lastRenderedPageBreak/>
         <w:t>Grateful for controlled air, measured light, sterile water, and predictable days. Grateful despite the ugliness beneath the system and the pain it kept out of sight.</w:t>
       </w:r>
     </w:p>
@@ -198,7 +197,6 @@
     </w:p>
     <w:p>
       <w:r>
-        <w:lastRenderedPageBreak/>
         <w:t>Ashoka's representative did not hurry. He did not need to. He crossed the floor broad-shouldered and expressionless, a scar tracing one side of his jaw.</w:t>
       </w:r>
     </w:p>
@@ -229,17 +227,17 @@
     </w:p>
     <w:p>
       <w:r>
-        <w:t>Rowan moved to EVENT and keyed in with two fingers. His display bloomed with intake feeds, incident streams, and narrative flags waiting to be classified.</w:t>
+        <w:t>Rowan moved to EVENT, the Chanakya station, because Chanakya taught that power began by deciding which events were allowed to mean something. His display bloomed with intake feeds, incident streams, and narrative flags waiting to be classified.</w:t>
       </w:r>
     </w:p>
     <w:p>
       <w:r>
-        <w:t>Elara took VARIANCE. Her panels lit with pattern drift, stress spikes, deviation corridors, and probability envelopes. Her job was to notice when the system's story and the data's behavior stopped agreeing.</w:t>
+        <w:t>Elara took VARIANCE, the Drona station, because Drona's first obligation was to follow knowledge wherever it led, especially when the data exposed a flaw the system preferred not to name. Her panels lit with pattern drift, stress spikes, deviation corridors, and probability envelopes. Her job was to notice when the system's story and the data's behavior stopped agreeing.</w:t>
       </w:r>
     </w:p>
     <w:p>
       <w:r>
-        <w:t>Daren lowered himself into THRESHOLD. Intervention bands, cost triggers, acceptable-loss curves, resource release windows. He did not watch people first. He watched limits.</w:t>
+        <w:t>Daren lowered himself into THRESHOLD, the Kubera station, where allocation became a question of what could be spent, withheld, or sacrificed without endangering the whole. Intervention bands, cost triggers, acceptable-loss curves, resource release windows. He did not watch people first. He watched limits.</w:t>
       </w:r>
     </w:p>
     <w:p>
@@ -253,15 +251,9 @@
       </w:r>
     </w:p>
     <w:p>
-      <w:r/>
-    </w:p>
-    <w:p>
       <w:r>
         <w:t>The Initiation queue populated on screen—sixteen names materialized like component numbers in a system ledger, stripped of color or ceremony, rendered as mere data points in Trinity's inventory. Sixteen children. Four monitors. Four ganas. On paper, the mathematics promised a clean division. Predictable.</w:t>
       </w:r>
-    </w:p>
-    <w:p>
-      <w:r/>
     </w:p>
     <w:p>
       <w:r>
@@ -269,15 +261,9 @@
       </w:r>
     </w:p>
     <w:p>
-      <w:r/>
-    </w:p>
-    <w:p>
       <w:r>
         <w:t>Then the central grid flickered again.</w:t>
       </w:r>
-    </w:p>
-    <w:p>
-      <w:r/>
     </w:p>
     <w:p>
       <w:r>
@@ -285,7 +271,9 @@
       </w:r>
     </w:p>
     <w:p>
-      <w:r/>
+      <w:r>
+        <w:t>UNASSIGNED.</w:t>
+      </w:r>
     </w:p>
     <w:p>
       <w:r>
@@ -293,23 +281,9 @@
       </w:r>
     </w:p>
     <w:p>
-      <w:r/>
-    </w:p>
-    <w:p>
       <w:r>
         <w:t>UNASSIGNED.</w:t>
       </w:r>
-    </w:p>
-    <w:p>
-      <w:r/>
-    </w:p>
-    <w:p>
-      <w:r>
-        <w:t>UNASSIGNED.</w:t>
-      </w:r>
-    </w:p>
-    <w:p>
-      <w:r/>
     </w:p>
     <w:p>
       <w:r>
@@ -317,15 +291,9 @@
       </w:r>
     </w:p>
     <w:p>
-      <w:r/>
-    </w:p>
-    <w:p>
       <w:r>
         <w:t>This was probably the first time Trinity's surveillance system had encountered an anomaly of this kind. The four gana representatives searched the online archives and the printed manuals beside their consoles, but neither offered a reason for the designation or an instruction for what came next.</w:t>
       </w:r>
-    </w:p>
-    <w:p>
-      <w:r/>
     </w:p>
     <w:p>
       <w:r>
@@ -333,15 +301,9 @@
       </w:r>
     </w:p>
     <w:p>
-      <w:r/>
-    </w:p>
-    <w:p>
       <w:r>
         <w:t>"Wait," she said. "It's our first day. We cannot give them a reason to think we need supervision before we have even begun. Let's see if we can solve it ourselves."</w:t>
       </w:r>
-    </w:p>
-    <w:p>
-      <w:r/>
     </w:p>
     <w:p>
       <w:r>
@@ -349,15 +311,9 @@
       </w:r>
     </w:p>
     <w:p>
-      <w:r/>
-    </w:p>
-    <w:p>
       <w:r>
         <w:t>Daren moved first with the efficient certainty of someone who believed problems were problems and people were data points to organize. He spoke their names loudly, his voice carrying that particular disdain his gana was known for.</w:t>
       </w:r>
-    </w:p>
-    <w:p>
-      <w:r/>
     </w:p>
     <w:p>
       <w:r>
@@ -365,15 +321,9 @@
       </w:r>
     </w:p>
     <w:p>
-      <w:r/>
-    </w:p>
-    <w:p>
       <w:r>
         <w:t>There was a cruelty in the dismissal that was almost kind. By erasing their identities, Daren made them manageable. They became exceptions to sort through, not people to reckon with.</w:t>
       </w:r>
-    </w:p>
-    <w:p>
-      <w:r/>
     </w:p>
     <w:p>
       <w:r>
@@ -381,15 +331,9 @@
       </w:r>
     </w:p>
     <w:p>
-      <w:r/>
-    </w:p>
-    <w:p>
       <w:r>
         <w:t>She turned to Rohan. "Can you hold down the fort while we focus on sorting out these exceptions?"</w:t>
       </w:r>
-    </w:p>
-    <w:p>
-      <w:r/>
     </w:p>
     <w:p>
       <w:r>
@@ -397,15 +341,9 @@
       </w:r>
     </w:p>
     <w:p>
-      <w:r/>
-    </w:p>
-    <w:p>
       <w:r>
         <w:t>Elara was enjoying the familiar satisfactions that came from being the best in the room. It was not pride, exactly. It was something closer to relief. In a system built to measure and rank, at least she knew where she stood.</w:t>
       </w:r>
-    </w:p>
-    <w:p>
-      <w:r/>
     </w:p>
     <w:p>
       <w:r>
@@ -413,15 +351,9 @@
       </w:r>
     </w:p>
     <w:p>
-      <w:r/>
-    </w:p>
-    <w:p>
       <w:r>
         <w:t>"Male. Six feet four inches. Two hundred eighty pounds."</w:t>
       </w:r>
-    </w:p>
-    <w:p>
-      <w:r/>
     </w:p>
     <w:p>
       <w:r>
@@ -429,15 +361,9 @@
       </w:r>
     </w:p>
     <w:p>
-      <w:r/>
-    </w:p>
-    <w:p>
       <w:r>
         <w:t>"Wow. I didn't know there were teenagers that big anywhere, let alone in Trinity. How does he get that big on starch cubes alone?"</w:t>
       </w:r>
-    </w:p>
-    <w:p>
-      <w:r/>
     </w:p>
     <w:p>
       <w:r>
@@ -445,23 +371,14 @@
       </w:r>
     </w:p>
     <w:p>
-      <w:r/>
-    </w:p>
-    <w:p>
       <w:r>
         <w:t>"Do you all mind if I assign Gage to me?"</w:t>
       </w:r>
     </w:p>
     <w:p>
-      <w:r/>
-    </w:p>
-    <w:p>
       <w:r>
         <w:t>Everyone nodded. They didn't see the need for excitement or fascination with a lowly miner. But Elara saw it. Or at least some part of her did. She pushed it down, buried it under protocol, and claimed him as hers.</w:t>
       </w:r>
-    </w:p>
-    <w:p>
-      <w:r/>
     </w:p>
     <w:p>
       <w:r>
@@ -485,7 +402,6 @@
     </w:p>
     <w:p>
       <w:r>
-        <w:lastRenderedPageBreak/>
         <w:t>Rowan reached forward, his hand closing over the assignment console. "I'll take Ben."</w:t>
       </w:r>
     </w:p>

</xml_diff>